<commit_message>
redo for psyhological test
</commit_message>
<xml_diff>
--- a/text.docx
+++ b/text.docx
@@ -169,13 +169,113 @@
     </w:p>
     <w:p>
       <w:r>
-        <w:t xml:space="preserve">D) </w:t>
-      </w:r>
-      <w:proofErr w:type="spellStart"/>
-      <w:r>
-        <w:t>Джоуль</w:t>
-      </w:r>
-      <w:proofErr w:type="spellEnd"/>
+        <w:t>D) Джоуль</w:t>
+      </w:r>
+    </w:p>
+    <w:p/>
+    <w:p>
+      <w:pPr>
+        <w:rPr>
+          <w:lang w:val="ru-RU"/>
+        </w:rPr>
+      </w:pPr>
+      <w:r>
+        <w:t>3.</w:t>
+      </w:r>
+      <w:r>
+        <w:rPr>
+          <w:lang w:val="ru-RU"/>
+        </w:rPr>
+        <w:t>Аубакиров Арслан красавчик</w:t>
+      </w:r>
+    </w:p>
+    <w:p>
+      <w:pPr>
+        <w:rPr>
+          <w:lang w:val="ru-RU"/>
+        </w:rPr>
+      </w:pPr>
+      <w:r>
+        <w:t>A</w:t>
+      </w:r>
+      <w:r>
+        <w:rPr>
+          <w:lang w:val="ru-RU"/>
+        </w:rPr>
+        <w:t>)</w:t>
+      </w:r>
+      <w:r>
+        <w:rPr>
+          <w:lang w:val="ru-RU"/>
+        </w:rPr>
+        <w:t>Да</w:t>
+      </w:r>
+    </w:p>
+    <w:p>
+      <w:pPr>
+        <w:rPr>
+          <w:lang w:val="ru-RU"/>
+        </w:rPr>
+      </w:pPr>
+      <w:r>
+        <w:t>B</w:t>
+      </w:r>
+      <w:r>
+        <w:rPr>
+          <w:lang w:val="ru-RU"/>
+        </w:rPr>
+        <w:t>)</w:t>
+      </w:r>
+      <w:r>
+        <w:rPr>
+          <w:lang w:val="ru-RU"/>
+        </w:rPr>
+        <w:t xml:space="preserve"> не особо *</w:t>
+      </w:r>
+    </w:p>
+    <w:p>
+      <w:pPr>
+        <w:rPr>
+          <w:lang w:val="ru-RU"/>
+        </w:rPr>
+      </w:pPr>
+      <w:r>
+        <w:t>C</w:t>
+      </w:r>
+      <w:r>
+        <w:rPr>
+          <w:lang w:val="ru-RU"/>
+        </w:rPr>
+        <w:t>)</w:t>
+      </w:r>
+      <w:r>
+        <w:rPr>
+          <w:lang w:val="ru-RU"/>
+        </w:rPr>
+        <w:t>Я крутой чел</w:t>
+      </w:r>
+    </w:p>
+    <w:p>
+      <w:pPr>
+        <w:rPr>
+          <w:lang w:val="ru-RU"/>
+        </w:rPr>
+      </w:pPr>
+      <w:r>
+        <w:t>D</w:t>
+      </w:r>
+      <w:r>
+        <w:rPr>
+          <w:lang w:val="ru-RU"/>
+        </w:rPr>
+        <w:t>)</w:t>
+      </w:r>
+      <w:r>
+        <w:rPr>
+          <w:lang w:val="ru-RU"/>
+        </w:rPr>
+        <w:t>Зеленский</w:t>
+      </w:r>
     </w:p>
     <w:sectPr>
       <w:pgSz w:w="11906" w:h="16838"/>

</xml_diff>